<commit_message>
Enablement Word copies: seven documents built from the final sources
Co-Authored-By: Claude Fable 5.1 <noreply@anthropic.com>
</commit_message>
<xml_diff>
--- a/docs/enablement/word/Enablement-Glossary-v1.0.docx
+++ b/docs/enablement/word/Enablement-Glossary-v1.0.docx
@@ -1729,7 +1729,7 @@
           <w:sz w:val="21"/>
           <w:szCs w:val="21"/>
         </w:rPr>
-        <w:t xml:space="preserve"> Written in an architecture or planning document, not in the code. It is one of the package's three labels.</w:t>
+        <w:t xml:space="preserve"> In an architecture document, not in the code. It is one of the package's three labels.</w:t>
       </w:r>
     </w:p>
     <w:p>
@@ -3069,7 +3069,7 @@
           <w:sz w:val="21"/>
           <w:szCs w:val="21"/>
         </w:rPr>
-        <w:t xml:space="preserve"> A visitor action that counts as success for learning: a click, a dwell, a completed video, a wishlist add, an add to cart, a purchase, or an outcome the brand names. A named partner outcome, such as a referral, is credited like a click and never reported as a sale.</w:t>
+        <w:t xml:space="preserve"> A visitor action that counts as success for learning: a click, a dwell, a completed video, a wishlist add, an add to cart, a purchase, or one of two named partner outcomes, a pickup at a partner store or a referral to a partner retailer. A named partner outcome is credited like a click and never reported as a sale.</w:t>
       </w:r>
     </w:p>
     <w:p>
@@ -3501,7 +3501,7 @@
           <w:sz w:val="21"/>
           <w:szCs w:val="21"/>
         </w:rPr>
-        <w:t xml:space="preserve"> Writing receipts, outcomes and learning counts after an answer, which happens only with tracking consent. A page that asks the engine directly, without the SDK, is recorded, which is how the demos record; with the SDK as shipped, decisions are recorded only for slots set to count rendered pieces with durable recovery switched on, and no configuration has it on yet.</w:t>
+        <w:t xml:space="preserve"> Writing receipts, outcomes and learning counts after an answer, which happens only with tracking consent. A page that asks the engine directly, without the SDK, is recorded when its slots use the default served basis, which is how the demos record; with the SDK as shipped, decisions are recorded only for slots set to count rendered pieces with durable recovery switched on, and no configuration has it on yet.</w:t>
       </w:r>
     </w:p>
     <w:p>

</xml_diff>